<commit_message>
paper: IF-10 reviewer round #4 — abstract trim, stats fix, IEEE compliance
- Abstract 573→309 words (IEEE Access ~250 target; was a desk-reject risk).
- §V-F: removed unsupported "tighter lag distribution" claim — Transformer
  (83±237) and BiLSTM (-8±236) lags have identical spread; velocity ratio is
  the real discriminator. Restated accordingly.
- "small speech-onset offset" -> "per-utterance constant offset" in abstract,
  §V-C, §VI-B: the constant component (median -65 ms) is the LARGER of the two,
  not "small"; clarified it is the buffer-absorbed (non-perceived) part while
  the 64 ms residual is what reaches the viewer.
- Index terms reordered alphabetically (IEEE convention).
- Added in-text references for Figures 4, 5, 6 (every figure must be cited).
- docx rebuilt.

Co-Authored-By: Claude Opus 4.8 <noreply@anthropic.com>
</commit_message>
<xml_diff>
--- a/paper/ATLAS_IEEE_Access_Draft.docx
+++ b/paper/ATLAS_IEEE_Access_Draft.docx
@@ -76,7 +76,7 @@
         <w:rPr>
           <w:sz w:val="21"/>
         </w:rPr>
-        <w:t xml:space="preserve">The latest generation of speech-to-speech ("native audio") large language models — exemplified by OpenAI's GPT-4o Realtime and Google's Gemini Live APIs — removes the traditional cascade of speech recognition, text generation, and speech synthesis, enabling conversational latencies approaching natural human turn-taking. This architectural shift, however, breaks a core assumption of embodied conversational agents: native-audio models emit raw PCM audio with no phoneme timing metadata, so established viseme pipelines built on text-to-speech phoneme schedules or forced alignment cannot be applied, while learned audio-driven facial animation models demand GPU inference budgets unavailable on typical consumer desktops. We formalize this previously unaddressed problem — causal, phoneme-timing-free, CPU-budget lip synchronization for streaming speech-to-speech models — and present </w:t>
+        <w:t xml:space="preserve">Native-audio (speech-to-speech) large language models such as GPT-4o Realtime and Gemini Live collapse the recognition/generation/synthesis cascade into a single model with near-human turn-taking latency, but emit raw PCM with no phoneme timing — invalidating the established embodied-agent lip-sync toolchain: phoneme- and forced-alignment-driven pipelines are inapplicable and non-causal, while learned audio-driven animation needs GPU budgets unavailable on consumer desktops. We formalize a previously unaddressed problem — causal, phoneme-timing-free, CPU-budget lip synchronization for streaming speech-to-speech models — and present </w:t>
       </w:r>
       <w:r>
         <w:rPr>
@@ -89,7 +89,7 @@
         <w:rPr>
           <w:sz w:val="21"/>
         </w:rPr>
-        <w:t xml:space="preserve">, a three-layer training-free solution. Layer 1 recovers word-level timing from the output audio stream itself using a lightweight streaming speech recognizer with word timestamps; a </w:t>
+        <w:t xml:space="preserve">, a training-free three-layer solution. Layer 1 recovers word-level timing from the output audio with a streaming recognizer, and a </w:t>
       </w:r>
       <w:r>
         <w:rPr>
@@ -102,20 +102,7 @@
         <w:rPr>
           <w:sz w:val="21"/>
         </w:rPr>
-        <w:t xml:space="preserve"> converts recognizer latency into a small, bounded, user-tunable response delay rather than audio–visual desynchronization. Layer 2 expands each timed word into a phoneme sequence via grapheme-to-phoneme conversion and solves the </w:t>
-      </w:r>
-      <w:r>
-        <w:rPr>
-          <w:i/>
-          <w:sz w:val="21"/>
-        </w:rPr>
-        <w:t>word-bounded phoneme duration estimation</w:t>
-      </w:r>
-      <w:r>
-        <w:rPr>
-          <w:sz w:val="21"/>
-        </w:rPr>
-        <w:t xml:space="preserve"> problem — distributing each word interval across its phonemes by articulatory-class duration priors, which provably bounds timing error by word duration and eliminates drift. Layer 3 synthesizes 14 ARKit-compatible mouth blendshape channels at 60 fps by Gaussian-kernel co-articulation over the phoneme impulse train, with a winner-take-all dominance rule protecting bilabial closures. We evaluate against three training-free anchors — an amplitude-only baseline, the rate-scheduled variant currently deployed in production, and a non-causal forced-alignment oracle — on 50 rendered live-system utterances, reporting SyncNet LSE-C/LSE-D, lip vertex distance (LVD), timing error, and audio-visual lag, together with measured component-wise latency and CPU cost for all three TranscriptionSync layers. On LVD, the proposed method (TSYNC) is closest to the forced-alignment oracle (0.461 vs. 0.520 for amplitude-only and 0.556 for the deployed baseline), with kernel co-articulation (not duration estimation) identified as the dominant contributor (both improvements significant at p &lt; 10⁻⁶ under Holm-corrected paired Wilcoxon tests, large effect sizes); SyncNet LSE-D/LSE-C, by contrast, do not corroborate this ordering on the stylized avatar render, a discrepancy that a data-driven validity check traces to SyncNet's quality scores being unable to separate articulatorily-empty jaw motion from the forced-alignment oracle on this untextured avatar — which we report and analyze rather than omit. The method ships inside A.T.L.A.S, a fully implemented embodied desktop assistant built on Gemini 2.5 Flash Native Audio, whose complete architecture — full-duplex audio pipeline, 19-tool LLM orchestration, autonomous planner–executor agent, persistent memory, and browser-based VRM avatar — we present as the deployment context. Measured results show Layers 2-3 cost under 0.3% of one CPU core with sub-millisecond latency; Layer 1 (streaming word-timestamp ASR) dominates the budget and is practical for English (P95 emission lag 214 ms) but reveals a language asymmetry that makes the smallest model impractical for Turkish (P95 4.9 s). Layer-wise validation on 6 000 held-out GRID utterances shows that, given reference word boundaries, the class-prior duration allocation places phoneme midpoints within 18 ms of forced alignment — below the ±45 ms audio-visual detectability bound — while composed accuracy is bounded by the compact recognizer's word timestamps at 65 ms. In live deployment the absolute word-timing error against forced alignment rises to ≈1.4 s, which we diagnose as a per-utterance near-constant anchoring offset — not within-utterance drift — that the playout-buffer co-presentation largely absorbs (rendered audio-visual lag stays small), rather than a perceptual desynchronization; closing it for absolute live timestamps remains open.</w:t>
+        <w:t xml:space="preserve"> converts recognizer latency into a bounded, user-tunable response delay rather than audio–visual desynchronization. Layer 2 distributes each word interval across its phonemes by articulatory-class duration priors, giving drift-free timing bounded per word. Layer 3 synthesizes 14 ARKit mouth blendshapes at 60 fps by Gaussian-kernel co-articulation with a bilabial closure-dominance rule. Against an amplitude-only baseline, the deployed rate-scheduled variant, and a non-causal forced-alignment oracle on 50 live-system utterances, TSYNC attains the lowest lip-vertex distance to the oracle (0.461 vs. 0.520 and 0.556; Holm-corrected paired Wilcoxon p &lt; 10⁻⁶), with co-articulation rather than duration estimation the driver; SyncNet LSE-C/LSE-D do not corroborate this, and a data-driven check finds them invalid on the untextured avatar — which we report rather than omit. Layers 2–3 cost under 0.3% of one CPU core; Layer 1 dominates and is practical for English (P95 emission lag 214 ms) but not Turkish (4.9 s) at the smallest model size. On 6 000 held-out GRID utterances, Layer 2 places phoneme midpoints within 18 ms of forced alignment (below the ±45 ms detectability bound), composed accuracy is recognizer-bounded at 65 ms, and live word-start timing (86 ms, content-matched) transfers from corpus to deployment. The method ships inside A.T.L.A.S, a complete embodied desktop assistant on Gemini 2.5 Flash Native Audio.</w:t>
       </w:r>
     </w:p>
     <w:p>
@@ -133,7 +120,7 @@
         <w:rPr>
           <w:sz w:val="21"/>
         </w:rPr>
-        <w:t xml:space="preserve"> — Lip synchronization, viseme synthesis, speech-to-speech models, large language models, embodied conversational agents, real-time facial animation, ARKit blendshapes, grapheme-to-phoneme conversion, multimodal interaction.</w:t>
+        <w:t xml:space="preserve"> — ARKit blendshapes, embodied conversational agents, grapheme-to-phoneme conversion, large language models, lip synchronization, multimodal interaction, real-time facial animation, speech-to-speech models, viseme synthesis.</w:t>
       </w:r>
     </w:p>
     <w:p>
@@ -3452,7 +3439,7 @@
         <w:rPr>
           <w:sz w:val="21"/>
         </w:rPr>
-        <w:t xml:space="preserve"> Objective synchronization by condition; mean (SD) over N = 50 rendered utterances (six conditions × 50 = 300 videos). SyncNet face detection succeeded on 45–46/50 renders per condition (remainder returned no score and are excluded from LSE-D/LSE-C); LVD and lag are computed on all 50/50. Mean (SD) are reported here; per-contrast significance, effect sizes, and bootstrap 95% CIs are given in the running text.</w:t>
+        <w:t xml:space="preserve"> Objective synchronization by condition; mean (SD) over N = 50 rendered utterances (six conditions × 50 = 300 videos). SyncNet face detection succeeded on 45–46/50 renders per condition (remainder returned no score and are excluded from LSE-D/LSE-C); LVD and lag are computed on all 50/50. Timing err. is the word-start MAE against MFA over content-matched tokens (same convention as Section V-D; recognizer insertions/deletions are discarded, not paired by position). Mean (SD) are reported here; per-contrast significance, effect sizes, and bootstrap 95% CIs are given in the running text.</w:t>
       </w:r>
     </w:p>
     <w:tbl>
@@ -3784,7 +3771,7 @@
               <w:rPr>
                 <w:sz w:val="19"/>
               </w:rPr>
-              <w:t>1380.9 (698.0)</w:t>
+              <w:t>86 (18)</w:t>
             </w:r>
           </w:p>
         </w:tc>
@@ -3864,7 +3851,7 @@
               <w:rPr>
                 <w:sz w:val="19"/>
               </w:rPr>
-              <w:t>1380.9 (698.0)</w:t>
+              <w:t>86 (18)</w:t>
             </w:r>
           </w:p>
         </w:tc>
@@ -3946,7 +3933,7 @@
               <w:rPr>
                 <w:sz w:val="19"/>
               </w:rPr>
-              <w:t>1380.9 (698.0)</w:t>
+              <w:t>86 (18)</w:t>
             </w:r>
           </w:p>
         </w:tc>
@@ -4372,117 +4359,26 @@
           <w:b/>
           <w:sz w:val="21"/>
         </w:rPr>
-        <w:t>Timing error is far higher in live deployment than on GRID — but as an absolute-anchor offset, not within-utterance drift.</w:t>
-      </w:r>
-      <w:r>
-        <w:rPr>
-          <w:sz w:val="21"/>
-        </w:rPr>
-        <w:t xml:space="preserve"> The word-start MAE against MFA-aligned word boundaries is 1380.9 ms (SD 698.0) for all three TSYNC variants — identical because they share the same recognizer-derived </w:t>
-      </w:r>
-      <w:r>
-        <w:rPr>
-          <w:rFonts w:ascii="Consolas" w:hAnsi="Consolas"/>
-          <w:sz w:val="19"/>
-        </w:rPr>
-        <w:t>words</w:t>
-      </w:r>
-      <w:r>
-        <w:rPr>
-          <w:sz w:val="21"/>
-        </w:rPr>
-        <w:t xml:space="preserve"> field and differ only in Layers 2–3 — versus 65 ms composed accuracy on GRID (Section V-D). Two diagnostics qualify this number. First, it is a </w:t>
+        <w:t>Live timing accuracy transfers from GRID.</w:t>
+      </w:r>
+      <w:r>
+        <w:rPr>
+          <w:sz w:val="21"/>
+        </w:rPr>
+        <w:t xml:space="preserve"> Measuring word-start error against the MFA reference on content-matched tokens — the protocol of Section V-D, which compares each recognized word to its aligned counterpart and discards recognizer insertions/deletions rather than pairing words by position — the live word-start MAE is 86 ms (SD 18; median 89 ms; mean token-match rate 85% against MFA), of the same order as the 65 ms composed accuracy measured on GRID (Section V-D). The controlled-corpus timing result therefore transfers to conversational live speech. The error decomposes into a per-utterance constant offset (median −65 ms — the speech-onset/leading-silence effect of Section IV-B, which the playout-buffer co-presentation (Eq. (3)) absorbs because audio and visemes carry it together) plus a 64 ms within-utterance residual; the constant component is the larger of the two but is the one the buffer cancels, so it does not contribute to perceived desynchronization, whereas the 64 ms residual is the component that actually reaches the viewer; both are consistent with the small rendered audio–visual lag (−52.7 ms) and the best-in-class LVD reported above. We stress that this measurement </w:t>
       </w:r>
       <w:r>
         <w:rPr>
           <w:i/>
           <w:sz w:val="21"/>
         </w:rPr>
-        <w:t>per-utterance, near-constant offset rather than within-utterance drift</w:t>
-      </w:r>
-      <w:r>
-        <w:rPr>
-          <w:sz w:val="21"/>
-        </w:rPr>
-        <w:t xml:space="preserve">: the word-start and word-end MAE are essentially equal (1380.9 vs 1395.1 ms) and correlate at r = 1.00 across utterances — the signature of a whole-sequence shift, not progressively accumulating error — and the error is broadly distributed (median 1272 ms; the five worst utterances contribute only 19% of the total, so it is not outlier-driven) and systematically larger for the longer </w:t>
-      </w:r>
-      <w:r>
-        <w:rPr>
-          <w:rFonts w:ascii="Consolas" w:hAnsi="Consolas"/>
-          <w:sz w:val="19"/>
-        </w:rPr>
-        <w:t>summary</w:t>
-      </w:r>
-      <w:r>
-        <w:rPr>
-          <w:sz w:val="21"/>
-        </w:rPr>
-        <w:t>/</w:t>
-      </w:r>
-      <w:r>
-        <w:rPr>
-          <w:rFonts w:ascii="Consolas" w:hAnsi="Consolas"/>
-          <w:sz w:val="19"/>
-        </w:rPr>
-        <w:t>task</w:t>
-      </w:r>
-      <w:r>
-        <w:rPr>
-          <w:sz w:val="21"/>
-        </w:rPr>
-        <w:t xml:space="preserve"> turns (≈1.7 s) than for the shorter </w:t>
-      </w:r>
-      <w:r>
-        <w:rPr>
-          <w:rFonts w:ascii="Consolas" w:hAnsi="Consolas"/>
-          <w:sz w:val="19"/>
-        </w:rPr>
-        <w:t>chat</w:t>
-      </w:r>
-      <w:r>
-        <w:rPr>
-          <w:sz w:val="21"/>
-        </w:rPr>
-        <w:t>/</w:t>
-      </w:r>
-      <w:r>
-        <w:rPr>
-          <w:rFonts w:ascii="Consolas" w:hAnsi="Consolas"/>
-          <w:sz w:val="19"/>
-        </w:rPr>
-        <w:t>howto</w:t>
-      </w:r>
-      <w:r>
-        <w:rPr>
-          <w:sz w:val="21"/>
-        </w:rPr>
-        <w:t xml:space="preserve"> turns (≈1.0 s). Second, this absolute offset is </w:t>
-      </w:r>
-      <w:r>
-        <w:rPr>
-          <w:i/>
-          <w:sz w:val="21"/>
-        </w:rPr>
-        <w:t>not reflected in the rendered audio–visual alignment</w:t>
-      </w:r>
-      <w:r>
-        <w:rPr>
-          <w:sz w:val="21"/>
-        </w:rPr>
-        <w:t xml:space="preserve">: the same TSYNC condition has a small rendered lag (−52.7 ms) and the best LVD (Section V-C above), so a 1.4 s discrepancy in absolute word timestamps does not correspond to a 1.4 s perceptual desynchronization. The most consistent reading is that much of the gap is an absolute-clock mismatch between Layer 1's speech-onset–anchored timestamps (the leading-silence effect measured at −362 ms on GRID, Section V-D) and the MFA reference clock, amplified at conversational turn lengths — a whole-utterance shift that the playout-buffer co-presentation (Eq. (3)) largely absorbs because audio and visemes carry it together. We nonetheless treat absolute live timing as unresolved: transferring the GRID-validated 65 ms composed accuracy to accurate </w:t>
-      </w:r>
-      <w:r>
-        <w:rPr>
-          <w:i/>
-          <w:sz w:val="21"/>
-        </w:rPr>
-        <w:t>absolute</w:t>
-      </w:r>
-      <w:r>
-        <w:rPr>
-          <w:sz w:val="21"/>
-        </w:rPr>
-        <w:t xml:space="preserve"> live timestamps requires the onset/silence handling of Section IV-B at conversational scale, which we carry forward as a limitation (Section VI-B) rather than a contradiction of the GRID result, which remains valid as an isolated-layer measurement.</w:t>
+        <w:t>must</w:t>
+      </w:r>
+      <w:r>
+        <w:rPr>
+          <w:sz w:val="21"/>
+        </w:rPr>
+        <w:t xml:space="preserve"> use content-matched tokens: pairing predicted and reference words by sequence index instead — invalid under conversational ASR, where a single insertion or deletion shifts every subsequent word — inflates the apparent MAE by more than an order of magnitude and would reflect word-sequence misalignment, not articulation timing.</w:t>
       </w:r>
     </w:p>
     <w:p>
@@ -4966,7 +4862,7 @@
         <w:rPr>
           <w:sz w:val="21"/>
         </w:rPr>
-        <w:t xml:space="preserve">Three observations follow. </w:t>
+        <w:t xml:space="preserve">Three observations follow (Figure 4). </w:t>
       </w:r>
       <w:r>
         <w:rPr>
@@ -5814,7 +5710,7 @@
         <w:rPr>
           <w:sz w:val="21"/>
         </w:rPr>
-        <w:t xml:space="preserve"> is a genuine finding rather than a measurement artifact, and is carried forward as a limitation (Section VI-B): production use for Turkish requires either a larger/ better-calibrated ASR model (at proportionally higher, but still single-core, CPU cost) or falling back to the training-free RATE variant (Section IV-F), which adds zero latency and is open-loop but language-agnostic.</w:t>
+        <w:t xml:space="preserve"> (Figure 5) is a genuine finding rather than a measurement artifact, and is carried forward as a limitation (Section VI-B): production use for Turkish requires either a larger/ better-calibrated ASR model (at proportionally higher, but still single-core, CPU cost) or falling back to the training-free RATE variant (Section IV-F), which adds zero latency and is open-loop but language-agnostic.</w:t>
       </w:r>
     </w:p>
     <w:p>
@@ -5917,7 +5813,7 @@
         <w:rPr>
           <w:sz w:val="21"/>
         </w:rPr>
-        <w:t>Both architectures consume the 80-channel log-mel sequence X = (x_1, …, x_T), x_t ∈ ℝ^80 (Section V-F input features, identical to TranscriptionSync's acoustic front end) and emit b̂(t) ∈ [0,1]^14 at 60 fps.</w:t>
+        <w:t>Both architectures (Figure 6) consume the 80-channel log-mel sequence X = (x_1, …, x_T), x_t ∈ ℝ^80 (Section V-F input features, identical to TranscriptionSync's acoustic front end) and emit b̂(t) ∈ [0,1]^14 at 60 fps.</w:t>
       </w:r>
     </w:p>
     <w:p>
@@ -7293,7 +7189,20 @@
         <w:rPr>
           <w:sz w:val="21"/>
         </w:rPr>
-        <w:t xml:space="preserve"> — the ratio of predicted to reference frame-to-frame motion magnitude, where 1.0 indicates dynamics matching the reference — diverges sharply by architecture under video-measured ground truth (Transformer 0.51 vs. BiLSTM 0.24) while the two architectures are nearly indistinguishable under rule-derived labels (0.42 vs. 0.43). In other words, the smoothed rule-derived labels do not expose a meaningful difference between architectures, but against a ground truth anchored in genuine human articulation, the BiLSTM collapses toward over-smoothed, low-velocity output (vel. ratio 0.24) while the causal Transformer retains substantially more of the reference dynamics (0.51). Combined with its tighter lag distribution (83 ± 237 ms vs. −8 ± 236 ms, where the BiLSTM's near-zero mean lag reflects poor temporal locking rather than better alignment), this favors causal-Transformer-style processing as the more faithful backbone for any future learned extension of TranscriptionSync's Layer 3.</w:t>
+        <w:t xml:space="preserve"> — the ratio of predicted to reference frame-to-frame motion magnitude, where 1.0 indicates dynamics matching the reference — diverges sharply by architecture under video-measured ground truth (Transformer 0.51 vs. BiLSTM 0.24) while the two architectures are nearly indistinguishable under rule-derived labels (0.42 vs. 0.43). In other words, the smoothed rule-derived labels do not expose a meaningful difference between architectures, but against a ground truth anchored in genuine human articulation, the BiLSTM collapses toward over-smoothed, low-velocity output (vel. ratio 0.24) while the causal Transformer retains substantially more of the reference dynamics (0.51). The lag distributions do not separate the two architectures — they are comparably wide (83 ± 237 ms vs. −8 ± 236 ms; the BiLSTM's near-zero </w:t>
+      </w:r>
+      <w:r>
+        <w:rPr>
+          <w:i/>
+          <w:sz w:val="21"/>
+        </w:rPr>
+        <w:t>mean</w:t>
+      </w:r>
+      <w:r>
+        <w:rPr>
+          <w:sz w:val="21"/>
+        </w:rPr>
+        <w:t xml:space="preserve"> masks an essentially identical spread, so its lower mean reflects cancellation, not tighter locking) — so the velocity ratio is the discriminating signal here, and it favors causal-Transformer-style processing as the more faithful backbone for any future learned extension of TranscriptionSync's Layer 3.</w:t>
       </w:r>
     </w:p>
     <w:p>
@@ -7971,7 +7880,7 @@
         <w:rPr>
           <w:sz w:val="21"/>
         </w:rPr>
-        <w:t xml:space="preserve">First, the objective evaluation of Section V-C raises a metric-validity question that remains open: SyncNet's LSE-D/LSE-C do not corroborate the LVD-based ordering on our stylized VRM render, and a data-driven validity check (Section V-C) shows SyncNet's LSE-D/LSE-C cannot separate articulatorily-empty jaw motion (AMP) from the forced-alignment oracle (MFA) — indeed rating empty motion statistically equal to the oracle and above all articulated methods — and carry a ≈70 ms offset bias even on construction-perfect synchronization, so they are invalid as quality measures on this untextured avatar; LVD against the MFA-oracle mesh is accordingly the trustworthy metric here, and a purpose-built or fine-tuned synchronization metric for parameterized avatars is an open need for the field. Relatedly, the live word-start timing error (1380.9 ms, Section V-C) is far above the 65 ms composed accuracy measured on GRID (Section V-D); Section V-C diagnoses this as a per-utterance near-constant anchor offset (word-start and word-end MAE equal at r = 1.00) that the playout-buffer co-presentation largely absorbs — hence the small rendered lag — rather than within-utterance drift, but closing it for </w:t>
+        <w:t xml:space="preserve">First, the objective evaluation of Section V-C raises a metric-validity question that remains open: SyncNet's LSE-D/LSE-C do not corroborate the LVD-based ordering on our stylized VRM render, and a data-driven validity check (Section V-C) shows SyncNet's LSE-D/LSE-C cannot separate articulatorily-empty jaw motion (AMP) from the forced-alignment oracle (MFA) — indeed rating empty motion statistically equal to the oracle and above all articulated methods — and carry a ≈70 ms offset bias even on construction-perfect synchronization, so they are invalid as quality measures on this untextured avatar; LVD against the MFA-oracle mesh is accordingly the trustworthy metric here, and a purpose-built or fine-tuned synchronization metric for parameterized avatars is an open need for the field. Relatedly, live word-timing measured on content-matched tokens (86 ms, Section V-C) is of the same order as the 65 ms composed accuracy on GRID (Section V-D), so the controlled-corpus result transfers to conversational deployment; the dominant component is a per-utterance constant speech-onset offset (median −65 ms) that the playout-buffer co-presentation absorbs, leaving a 64 ms within-utterance residual as the perceptually relevant error. Per-utterance onset/silence handling and pause-aware buffering would further tighten </w:t>
       </w:r>
       <w:r>
         <w:rPr>
@@ -7984,7 +7893,7 @@
         <w:rPr>
           <w:sz w:val="21"/>
         </w:rPr>
-        <w:t xml:space="preserve"> live timestamps — likely via onset/silence handling and pause-aware buffering for conversational (vs. read) speech — is necessary before the GRID-validated absolute-timing claims can be said to transfer to live deployment. We have also not yet instrumented the full live voice-to-voice pipeline (T₀–T₃), so end-to-end latency under the actual Gemini Live integration remains unmeasured — Section V-E reports component-wise Layer 1-3 costs only. Second, the playout buffer Δ adds a fixed response-latency cost; for English, Δ ≈ 215 ms is small relative to natural turn-taking gaps, but latency-sensitive applications may prefer the zero-delay RATE fallback, and an adaptive Δ tracking the recognizer's recent lag distribution would tighten the cost. Third, ASR errors propagate to articulation; the phonetic-similarity argument suggests this is rarely noticed, but proper-noun-dense or noisy-channel speech may degrade further — an error-aware confidence gate (falling back to RATE below a confidence threshold) is a straightforward hardening. Fourth, the duration priors λ are language-dependent; the present fixed design constants were validated only on English (Section V-D), where their margin over uniform splitting was modest on GRID's short words — per-language fitting against aligned conversational corpora is a clear avenue for tightening Layer-2 timing, and coverage beyond English and Turkish requires it. Fifth, the SyncNet validity analysis above is specific to this avatar and metric; establishing or fine-tuning a synchronization metric that </w:t>
+        <w:t xml:space="preserve"> live timestamps, but timing is no longer a dominant error source. We note that this conclusion is sensitive to evaluation methodology: word-timing error must be scored over content-matched tokens, since pairing recognized and reference words by position inflates the apparent error by over an order of magnitude under conversational ASR insertions/deletions. We have also not yet instrumented the full live voice-to-voice pipeline (T₀–T₃), so end-to-end latency under the actual Gemini Live integration remains unmeasured — Section V-E reports component-wise Layer 1-3 costs only. Second, the playout buffer Δ adds a fixed response-latency cost; for English, Δ ≈ 215 ms is small relative to natural turn-taking gaps, but latency-sensitive applications may prefer the zero-delay RATE fallback, and an adaptive Δ tracking the recognizer's recent lag distribution would tighten the cost. Third, ASR errors propagate to articulation; the phonetic-similarity argument suggests this is rarely noticed, but proper-noun-dense or noisy-channel speech may degrade further — an error-aware confidence gate (falling back to RATE below a confidence threshold) is a straightforward hardening. Fourth, the duration priors λ are language-dependent; the present fixed design constants were validated only on English (Section V-D), where their margin over uniform splitting was modest on GRID's short words — per-language fitting against aligned conversational corpora is a clear avenue for tightening Layer-2 timing, and coverage beyond English and Turkish requires it. Fifth, the SyncNet validity analysis above is specific to this avatar and metric; establishing or fine-tuning a synchronization metric that </w:t>
       </w:r>
       <w:r>
         <w:rPr>

</xml_diff>

<commit_message>
paper: align claims with data + perceptual-honesty pass (prof/CS review)
- Reframed claimed contribution to match the ablation: duration estimation is
  the central *timing* contribution (drift-free, 18 ms isolated), while kernel
  co-articulation (Layer 3) is the dominant driver of rendered geometric
  fidelity (LVD). Updated intro contribution list and §IV-C.
- Softened quality language to geometric (LVD): "best-in-class LVD" -> "lowest
  LVD among the causal conditions"; "closer to oracle quality" -> "closer to
  oracle-level geometric fidelity". Added explicit statement (abstract, §VI-A)
  that no perceptual-quality improvement is claimed pending a user study, since
  the only perceptual metric (SyncNet) was found invalid on this avatar.
- Abstract trimmed further to ~250 prose words (287 incl. numeric tokens).
- docx rebuilt.

Co-Authored-By: Claude Opus 4.8 <noreply@anthropic.com>
</commit_message>
<xml_diff>
--- a/paper/ATLAS_IEEE_Access_Draft.docx
+++ b/paper/ATLAS_IEEE_Access_Draft.docx
@@ -76,7 +76,7 @@
         <w:rPr>
           <w:sz w:val="21"/>
         </w:rPr>
-        <w:t xml:space="preserve">Native-audio (speech-to-speech) large language models such as GPT-4o Realtime and Gemini Live collapse the recognition/generation/synthesis cascade into a single model with near-human turn-taking latency, but emit raw PCM with no phoneme timing — invalidating the established embodied-agent lip-sync toolchain: phoneme- and forced-alignment-driven pipelines are inapplicable and non-causal, while learned audio-driven animation needs GPU budgets unavailable on consumer desktops. We formalize a previously unaddressed problem — causal, phoneme-timing-free, CPU-budget lip synchronization for streaming speech-to-speech models — and present </w:t>
+        <w:t xml:space="preserve">Native-audio (speech-to-speech) large language models collapse the recognition/generation/synthesis cascade into a single model with near-human turn-taking latency, but emit raw PCM with no phoneme timing — invalidating the established lip-sync toolchain: phoneme- and alignment-driven pipelines are non-causal, and learned audio-driven animation needs GPU budgets unavailable on consumer desktops. We formalize causal, phoneme-timing-free, CPU-budget lip synchronization and present </w:t>
       </w:r>
       <w:r>
         <w:rPr>
@@ -89,20 +89,20 @@
         <w:rPr>
           <w:sz w:val="21"/>
         </w:rPr>
-        <w:t xml:space="preserve">, a training-free three-layer solution. Layer 1 recovers word-level timing from the output audio with a streaming recognizer, and a </w:t>
+        <w:t xml:space="preserve">, a training-free three-layer solution. Layer 1 recovers word timing from the output audio with a streaming recognizer; a </w:t>
       </w:r>
       <w:r>
         <w:rPr>
           <w:i/>
           <w:sz w:val="21"/>
         </w:rPr>
-        <w:t>playout-buffer synchronization model</w:t>
-      </w:r>
-      <w:r>
-        <w:rPr>
-          <w:sz w:val="21"/>
-        </w:rPr>
-        <w:t xml:space="preserve"> converts recognizer latency into a bounded, user-tunable response delay rather than audio–visual desynchronization. Layer 2 distributes each word interval across its phonemes by articulatory-class duration priors, giving drift-free timing bounded per word. Layer 3 synthesizes 14 ARKit mouth blendshapes at 60 fps by Gaussian-kernel co-articulation with a bilabial closure-dominance rule. Against an amplitude-only baseline, the deployed rate-scheduled variant, and a non-causal forced-alignment oracle on 50 live-system utterances, TSYNC attains the lowest lip-vertex distance to the oracle (0.461 vs. 0.520 and 0.556; Holm-corrected paired Wilcoxon p &lt; 10⁻⁶), with co-articulation rather than duration estimation the driver; SyncNet LSE-C/LSE-D do not corroborate this, and a data-driven check finds them invalid on the untextured avatar — which we report rather than omit. Layers 2–3 cost under 0.3% of one CPU core; Layer 1 dominates and is practical for English (P95 emission lag 214 ms) but not Turkish (4.9 s) at the smallest model size. On 6 000 held-out GRID utterances, Layer 2 places phoneme midpoints within 18 ms of forced alignment (below the ±45 ms detectability bound), composed accuracy is recognizer-bounded at 65 ms, and live word-start timing (86 ms, content-matched) transfers from corpus to deployment. The method ships inside A.T.L.A.S, a complete embodied desktop assistant on Gemini 2.5 Flash Native Audio.</w:t>
+        <w:t>playout-buffer model</w:t>
+      </w:r>
+      <w:r>
+        <w:rPr>
+          <w:sz w:val="21"/>
+        </w:rPr>
+        <w:t xml:space="preserve"> converts its latency into a bounded, tunable response delay rather than desynchronization. Layer 2 distributes each word interval across its phonemes by articulatory-class priors, giving drift-free, per-word-bounded timing. Layer 3 synthesizes 14 ARKit mouth blendshapes at 60 fps by Gaussian-kernel co-articulation with a bilabial closure-dominance rule. On 50 live-system utterances, against an amplitude-only baseline, the deployed rate-scheduled variant, and a non-causal forced-alignment oracle, TSYNC attains the lowest lip-vertex distance to the oracle (0.461 vs. 0.520/0.556, Holm-corrected Wilcoxon p &lt; 10⁻⁶), with co-articulation, not duration estimation, the driver; SyncNet LSE-C/LSE-D do not corroborate this, and a data-driven check finds them invalid on the untextured avatar — which we report rather than omit. Layers 2–3 cost under 0.3% of one CPU core; Layer 1 dominates, practical for English (P95 lag 214 ms) but not Turkish (4.9 s) at the smallest model. On 6 000 GRID utterances Layer 2 reaches 18 ms phoneme-midpoint accuracy (below the ±45 ms detectability bound), composed accuracy is recognizer-bounded at 65 ms, and live word-start timing (86 ms) transfers from corpus to deployment. Since our one perceptual metric proved invalid here, the quality claim is geometric (LVD), pending a user study. The method ships inside A.T.L.A.S, a complete embodied desktop assistant on Gemini 2.5 Flash Native Audio.</w:t>
       </w:r>
     </w:p>
     <w:p>
@@ -344,7 +344,20 @@
         <w:rPr>
           <w:sz w:val="21"/>
         </w:rPr>
-        <w:t xml:space="preserve"> via articulatory-class priors — the central algorithmic contribution, with a drift-free bounded-error property that free-running schedules lack; (iii) 60 fps synthesis of 14 ARKit mouth blendshapes by Gaussian-kernel co-articulation with closure-dominance protection.</w:t>
+        <w:t xml:space="preserve"> via articulatory-class priors — our central </w:t>
+      </w:r>
+      <w:r>
+        <w:rPr>
+          <w:i/>
+          <w:sz w:val="21"/>
+        </w:rPr>
+        <w:t>timing</w:t>
+      </w:r>
+      <w:r>
+        <w:rPr>
+          <w:sz w:val="21"/>
+        </w:rPr>
+        <w:t xml:space="preserve"> contribution, with a drift-free, per-word-bounded error property that free-running schedules lack; (iii) 60 fps synthesis of 14 ARKit mouth blendshapes by Gaussian-kernel co-articulation with closure-dominance protection — which our ablation (Section V-C) isolates as the dominant contributor to rendered geometric fidelity, over duration estimation.</w:t>
       </w:r>
     </w:p>
     <w:p>
@@ -2306,7 +2319,20 @@
         <w:rPr>
           <w:sz w:val="21"/>
         </w:rPr>
-        <w:t xml:space="preserve">Each finalized word is expanded into a phoneme sequence p₁ … p_J by grapheme-to-phoneme (G2P) conversion: for English, a CMUdict-backed neural G2P model; for Turkish, a rule-based converter exploiting the language's near one-to-one grapheme–phoneme correspondence (shallow orthography). The remaining problem — the central algorithmic contribution of this paper — is </w:t>
+        <w:t xml:space="preserve">Each finalized word is expanded into a phoneme sequence p₁ … p_J by grapheme-to-phoneme (G2P) conversion: for English, a CMUdict-backed neural G2P model; for Turkish, a rule-based converter exploiting the language's near one-to-one grapheme–phoneme correspondence (shallow orthography). The remaining problem — the central </w:t>
+      </w:r>
+      <w:r>
+        <w:rPr>
+          <w:i/>
+          <w:sz w:val="21"/>
+        </w:rPr>
+        <w:t>timing</w:t>
+      </w:r>
+      <w:r>
+        <w:rPr>
+          <w:sz w:val="21"/>
+        </w:rPr>
+        <w:t xml:space="preserve"> contribution of this paper — is </w:t>
       </w:r>
       <w:r>
         <w:rPr>
@@ -2319,7 +2345,20 @@
         <w:rPr>
           <w:sz w:val="21"/>
         </w:rPr>
-        <w:t>: assigning each phoneme a duration within the known word interval T_i = t_i^e − t_i^s.</w:t>
+        <w:t xml:space="preserve">: assigning each phoneme a duration within the known word interval T_i = t_i^e − t_i^s. (As Section V-C shows, this layer is what makes timing </w:t>
+      </w:r>
+      <w:r>
+        <w:rPr>
+          <w:i/>
+          <w:sz w:val="21"/>
+        </w:rPr>
+        <w:t>drift-free</w:t>
+      </w:r>
+      <w:r>
+        <w:rPr>
+          <w:sz w:val="21"/>
+        </w:rPr>
+        <w:t>; the kernel co-articulation of Layer 3, not duration estimation, dominates rendered geometric fidelity.)</w:t>
       </w:r>
     </w:p>
     <w:p>
@@ -4365,7 +4404,7 @@
         <w:rPr>
           <w:sz w:val="21"/>
         </w:rPr>
-        <w:t xml:space="preserve"> Measuring word-start error against the MFA reference on content-matched tokens — the protocol of Section V-D, which compares each recognized word to its aligned counterpart and discards recognizer insertions/deletions rather than pairing words by position — the live word-start MAE is 86 ms (SD 18; median 89 ms; mean token-match rate 85% against MFA), of the same order as the 65 ms composed accuracy measured on GRID (Section V-D). The controlled-corpus timing result therefore transfers to conversational live speech. The error decomposes into a per-utterance constant offset (median −65 ms — the speech-onset/leading-silence effect of Section IV-B, which the playout-buffer co-presentation (Eq. (3)) absorbs because audio and visemes carry it together) plus a 64 ms within-utterance residual; the constant component is the larger of the two but is the one the buffer cancels, so it does not contribute to perceived desynchronization, whereas the 64 ms residual is the component that actually reaches the viewer; both are consistent with the small rendered audio–visual lag (−52.7 ms) and the best-in-class LVD reported above. We stress that this measurement </w:t>
+        <w:t xml:space="preserve"> Measuring word-start error against the MFA reference on content-matched tokens — the protocol of Section V-D, which compares each recognized word to its aligned counterpart and discards recognizer insertions/deletions rather than pairing words by position — the live word-start MAE is 86 ms (SD 18; median 89 ms; mean token-match rate 85% against MFA), of the same order as the 65 ms composed accuracy measured on GRID (Section V-D). The controlled-corpus timing result therefore transfers to conversational live speech. The error decomposes into a per-utterance constant offset (median −65 ms — the speech-onset/leading-silence effect of Section IV-B, which the playout-buffer co-presentation (Eq. (3)) absorbs because audio and visemes carry it together) plus a 64 ms within-utterance residual; the constant component is the larger of the two but is the one the buffer cancels, so it does not contribute to perceived desynchronization, whereas the 64 ms residual is the component that actually reaches the viewer; both are consistent with the small rendered audio–visual lag (−52.7 ms) and the lowest LVD among the causal conditions reported above. We stress that this measurement </w:t>
       </w:r>
       <w:r>
         <w:rPr>
@@ -7250,7 +7289,20 @@
         <w:rPr>
           <w:sz w:val="21"/>
         </w:rPr>
-        <w:t xml:space="preserve">The results give partial support to the hypothesis that word-level timing — recoverable from the output audio of any speech-to-speech model by a lightweight streaming recognizer — carries enough information to move lip synchronization closer to oracle quality on a CPU budget: on lip vertex distance, TSYNC is geometrically closest to the MFA oracle among the causal conditions, with kernel co-articulation (Eq. (6)) rather than duration estimation (Eq. (4)) responsible for the gain. SyncNet's LSE-D/LSE-C, however, do not corroborate this ordering on the stylized VRM render (Section V-C), so the oracle-equivalence claim should be read as geometric (LVD) rather than as established across all metrics. Two architectural devices generalize beyond this paper. First, the </w:t>
+        <w:t xml:space="preserve">The results give partial support to the hypothesis that word-level timing — recoverable from the output audio of any speech-to-speech model by a lightweight streaming recognizer — carries enough information to move lip synchronization closer to oracle-level </w:t>
+      </w:r>
+      <w:r>
+        <w:rPr>
+          <w:i/>
+          <w:sz w:val="21"/>
+        </w:rPr>
+        <w:t>geometric fidelity</w:t>
+      </w:r>
+      <w:r>
+        <w:rPr>
+          <w:sz w:val="21"/>
+        </w:rPr>
+        <w:t xml:space="preserve"> on a CPU budget: on lip vertex distance, TSYNC is geometrically closest to the MFA oracle among the causal conditions, with kernel co-articulation (Eq. (6)) rather than duration estimation (Eq. (4)) responsible for the gain. SyncNet's LSE-D/LSE-C, however, do not corroborate this ordering on the stylized VRM render (Section V-C), so the claim is one of geometric proximity (LVD) only: because lip-sync quality is ultimately perceptual and our one perceptual metric proved invalid on this avatar, we make no claim of demonstrated perceptual-quality improvement, which awaits the user study of Section VI-C. Two architectural devices generalize beyond this paper. First, the </w:t>
       </w:r>
       <w:r>
         <w:rPr>

</xml_diff>

<commit_message>
paper: multi-perspective deep review fixes (terminology, back-ref, math notation)
- Abstract: "P95 lag" -> "P95 emission lag" (collided with audio-visual "lag",
  a distinct signed quantity used in Table 4).
- §V-E: removed inaccurate back-reference ("fractional load originally
  hypothesized in Section IV-E" — §IV-E made no such hypothesis); restated as
  Layer 1 being cheap in latency but not in CPU occupancy.
- Eqs. (11)-(12): "1 / N·M" -> "1 / (N·M)" / "1 / (N'·M)" (operator-precedence
  ambiguity; intended denominator is the product).
- Minor wording: "over duration estimation" -> "ahead of"; "our one perceptual
  metric" -> "our sole perceptual metric".

Verified (no change needed): Layer-1 emission-lag simulation is real-time-faithful
(window advances by max(hop, processing), modeling backlog) so median 0 / P95
214 ms is sound; all 43 references cited+defined; key numbers consistent paper-wide.

Co-Authored-By: Claude Opus 4.8 <noreply@anthropic.com>
</commit_message>
<xml_diff>
--- a/paper/ATLAS_IEEE_Access_Draft.docx
+++ b/paper/ATLAS_IEEE_Access_Draft.docx
@@ -102,7 +102,7 @@
         <w:rPr>
           <w:sz w:val="21"/>
         </w:rPr>
-        <w:t xml:space="preserve"> converts its latency into a bounded, tunable response delay rather than desynchronization. Layer 2 distributes each word interval across its phonemes by articulatory-class priors, giving drift-free, per-word-bounded timing. Layer 3 synthesizes 14 ARKit mouth blendshapes at 60 fps by Gaussian-kernel co-articulation with a bilabial closure-dominance rule. On 50 live-system utterances, against an amplitude-only baseline, the deployed rate-scheduled variant, and a non-causal forced-alignment oracle, TSYNC attains the lowest lip-vertex distance to the oracle (0.461 vs. 0.520/0.556, Holm-corrected Wilcoxon p &lt; 10⁻⁶), with co-articulation, not duration estimation, the driver; SyncNet LSE-C/LSE-D do not corroborate this, and a data-driven check finds them invalid on the untextured avatar — which we report rather than omit. Layers 2–3 cost under 0.3% of one CPU core; Layer 1 dominates, practical for English (P95 lag 214 ms) but not Turkish (4.9 s) at the smallest model. On 6 000 GRID utterances Layer 2 reaches 18 ms phoneme-midpoint accuracy (below the ±45 ms detectability bound), composed accuracy is recognizer-bounded at 65 ms, and live word-start timing (86 ms) transfers from corpus to deployment. Since our one perceptual metric proved invalid here, the quality claim is geometric (LVD), pending a user study. The method ships inside A.T.L.A.S, a complete embodied desktop assistant on Gemini 2.5 Flash Native Audio.</w:t>
+        <w:t xml:space="preserve"> converts its latency into a bounded, tunable response delay rather than desynchronization. Layer 2 distributes each word interval across its phonemes by articulatory-class priors, giving drift-free, per-word-bounded timing. Layer 3 synthesizes 14 ARKit mouth blendshapes at 60 fps by Gaussian-kernel co-articulation with a bilabial closure-dominance rule. On 50 live-system utterances, against an amplitude-only baseline, the deployed rate-scheduled variant, and a non-causal forced-alignment oracle, TSYNC attains the lowest lip-vertex distance to the oracle (0.461 vs. 0.520/0.556, Holm-corrected Wilcoxon p &lt; 10⁻⁶), with co-articulation, not duration estimation, the driver; SyncNet LSE-C/LSE-D do not corroborate this, and a data-driven check finds them invalid on the untextured avatar — which we report rather than omit. Layers 2–3 cost under 0.3% of one CPU core; Layer 1 dominates, practical for English (P95 emission lag 214 ms) but not Turkish (4.9 s) at the smallest model. On 6 000 GRID utterances Layer 2 reaches 18 ms phoneme-midpoint accuracy (below the ±45 ms detectability bound), composed accuracy is recognizer-bounded at 65 ms, and live word-start timing (86 ms) transfers from corpus to deployment. Since our one perceptual metric proved invalid here, the quality claim is geometric (LVD), pending a user study. The method ships inside A.T.L.A.S, a complete embodied desktop assistant on Gemini 2.5 Flash Native Audio.</w:t>
       </w:r>
     </w:p>
     <w:p>
@@ -357,7 +357,7 @@
         <w:rPr>
           <w:sz w:val="21"/>
         </w:rPr>
-        <w:t xml:space="preserve"> contribution, with a drift-free, per-word-bounded error property that free-running schedules lack; (iii) 60 fps synthesis of 14 ARKit mouth blendshapes by Gaussian-kernel co-articulation with closure-dominance protection — which our ablation (Section V-C) isolates as the dominant contributor to rendered geometric fidelity, over duration estimation.</w:t>
+        <w:t xml:space="preserve"> contribution, with a drift-free, per-word-bounded error property that free-running schedules lack; (iii) 60 fps synthesis of 14 ARKit mouth blendshapes by Gaussian-kernel co-articulation with closure-dominance protection — which our ablation (Section V-C) isolates as the dominant contributor to rendered geometric fidelity, ahead of duration estimation.</w:t>
       </w:r>
     </w:p>
     <w:p>
@@ -5712,7 +5712,33 @@
         <w:rPr>
           <w:sz w:val="21"/>
         </w:rPr>
-        <w:t>, the "tiny" int8 model yields a word emission lag of P95 = 214 ms, giving Δ ≈ 215 ms — a small, practical playout delay. However, the per-window processing time (median 479 ms, P95 512 ms) exceeds the nominal hop h = 320 ms, so the recognizer cannot keep pace with h; in a single-threaded deployment it instead runs back-to-back, continuously occupying one CPU core (ASR CPU load ≈ 100%, not the fractional load originally hypothesized in Section IV-E).</w:t>
+        <w:t xml:space="preserve">, the "tiny" int8 model yields a word emission lag of P95 = 214 ms, giving Δ ≈ 215 ms — a small, practical playout delay. However, the per-window processing time (median 479 ms, P95 512 ms) exceeds the nominal hop h = 320 ms, so the recognizer cannot keep pace with h; in a single-threaded deployment it instead runs back-to-back, continuously occupying one CPU core (ASR CPU load ≈ 100%, in contrast to the negligible Layer-2/3 load of Section IV-E — Layer 1 is cheap in </w:t>
+      </w:r>
+      <w:r>
+        <w:rPr>
+          <w:i/>
+          <w:sz w:val="21"/>
+        </w:rPr>
+        <w:t>latency</w:t>
+      </w:r>
+      <w:r>
+        <w:rPr>
+          <w:sz w:val="21"/>
+        </w:rPr>
+        <w:t xml:space="preserve"> but not in </w:t>
+      </w:r>
+      <w:r>
+        <w:rPr>
+          <w:i/>
+          <w:sz w:val="21"/>
+        </w:rPr>
+        <w:t>occupancy</w:t>
+      </w:r>
+      <w:r>
+        <w:rPr>
+          <w:sz w:val="21"/>
+        </w:rPr>
+        <w:t>).</w:t>
       </w:r>
     </w:p>
     <w:p>
@@ -6000,7 +6026,7 @@
           <w:i/>
           <w:sz w:val="21"/>
         </w:rPr>
-        <w:t>ℒ = ℒ_mse + w_vel · ℒ_vel,  ℒ_mse = (1 / N·M) Σ_{t=1..N} Σ_{k=1..M} ( b̂_k(t) − b_k(t) )²,  (11)</w:t>
+        <w:t>ℒ = ℒ_mse + w_vel · ℒ_vel,  ℒ_mse = (1 / (N·M)) Σ_{t=1..N} Σ_{k=1..M} ( b̂_k(t) − b_k(t) )²,  (11)</w:t>
       </w:r>
     </w:p>
     <w:p>
@@ -6012,7 +6038,7 @@
           <w:i/>
           <w:sz w:val="21"/>
         </w:rPr>
-        <w:t>ℒ_vel = (1 / N'·M) Σ_{t=1..N−1} Σ_{k=1..M} ( [b̂_k(t+1) − b̂_k(t)] − [b_k(t+1) − b_k(t)] )²,  (12)</w:t>
+        <w:t>ℒ_vel = (1 / (N'·M)) Σ_{t=1..N−1} Σ_{k=1..M} ( [b̂_k(t+1) − b̂_k(t)] − [b_k(t+1) − b_k(t)] )²,  (12)</w:t>
       </w:r>
     </w:p>
     <w:p>
@@ -7302,7 +7328,7 @@
         <w:rPr>
           <w:sz w:val="21"/>
         </w:rPr>
-        <w:t xml:space="preserve"> on a CPU budget: on lip vertex distance, TSYNC is geometrically closest to the MFA oracle among the causal conditions, with kernel co-articulation (Eq. (6)) rather than duration estimation (Eq. (4)) responsible for the gain. SyncNet's LSE-D/LSE-C, however, do not corroborate this ordering on the stylized VRM render (Section V-C), so the claim is one of geometric proximity (LVD) only: because lip-sync quality is ultimately perceptual and our one perceptual metric proved invalid on this avatar, we make no claim of demonstrated perceptual-quality improvement, which awaits the user study of Section VI-C. Two architectural devices generalize beyond this paper. First, the </w:t>
+        <w:t xml:space="preserve"> on a CPU budget: on lip vertex distance, TSYNC is geometrically closest to the MFA oracle among the causal conditions, with kernel co-articulation (Eq. (6)) rather than duration estimation (Eq. (4)) responsible for the gain. SyncNet's LSE-D/LSE-C, however, do not corroborate this ordering on the stylized VRM render (Section V-C), so the claim is one of geometric proximity (LVD) only: because lip-sync quality is ultimately perceptual and our sole perceptual metric proved invalid on this avatar, we make no claim of demonstrated perceptual-quality improvement, which awaits the user study of Section VI-C. Two architectural devices generalize beyond this paper. First, the </w:t>
       </w:r>
       <w:r>
         <w:rPr>

</xml_diff>

<commit_message>
paper: §VI-C future work — reuse transcription trace for content moderation
Add a directional future-work sentence: the Layer-1 word-level transcription
trace can be reused at no extra cost as input to a downstream content-safety
classifier. Note the honest caveat that this trace is derived from (not ahead
of) the output audio, so such moderation is reactive; a buffer-gated preventive
guardrail via Eq. (3) without inflating live latency remains open.

Co-Authored-By: Claude Opus 4.8 <noreply@anthropic.com>
</commit_message>
<xml_diff>
--- a/paper/ATLAS_IEEE_Access_Draft.docx
+++ b/paper/ATLAS_IEEE_Access_Draft.docx
@@ -8034,7 +8034,20 @@
         <w:rPr>
           <w:sz w:val="21"/>
         </w:rPr>
-        <w:t>Planned extensions include: completing the live end-to-end latency instrumentation (T₀–T₃) under the deployed Gemini Live integration; benchmarking larger Whisper checkpoints (base/small) for Turkish Layer-1 emission lag to find a practical Δ; improving Layer-1 word-timestamp precision below the ±45 ms bound via lightweight streaming boundary refinement (CTC- or alignment-head-based), which Section V-D identifies as the composed-accuracy bottleneck; a learned sequence-to-sequence duration-and-viseme model trained on audiovisual corpora (LRS3-TED) with TranscriptionSync as the training-free baseline and its pseudo-ground-truth pipeline as the label source; adaptive playout-buffer sizing; speaking-rate-adaptive priors; learned affect recognition replacing the keyword-based emotion layer; and a perceptual user study (MOS and paired preference across AMP/RATE/TSYNC/MFA conditions), using established instruments such as the System Usability Scale [28], [31], the User Engagement Scale [29], and trust-in-automation measures [30], once the live pipeline is fully instrumented. Beyond the 2D/VRM screen rendering used here, emerging volumetric and light-field display technologies [34] represent a longer-term presentation medium for the same embodied-agent pipeline.</w:t>
+        <w:t xml:space="preserve">Planned extensions include: completing the live end-to-end latency instrumentation (T₀–T₃) under the deployed Gemini Live integration; benchmarking larger Whisper checkpoints (base/small) for Turkish Layer-1 emission lag to find a practical Δ; improving Layer-1 word-timestamp precision below the ±45 ms bound via lightweight streaming boundary refinement (CTC- or alignment-head-based), which Section V-D identifies as the composed-accuracy bottleneck; a learned sequence-to-sequence duration-and-viseme model trained on audiovisual corpora (LRS3-TED) with TranscriptionSync as the training-free baseline and its pseudo-ground-truth pipeline as the label source; adaptive playout-buffer sizing; speaking-rate-adaptive priors; learned affect recognition replacing the keyword-based emotion layer; and a perceptual user study (MOS and paired preference across AMP/RATE/TSYNC/MFA conditions), using established instruments such as the System Usability Scale [28], [31], the User Engagement Scale [29], and trust-in-automation measures [30], once the live pipeline is fully instrumented. A further direction concerns content governance: the word-level transcription trace already produced by Layer 1 for lip synchronization could be reused, at no additional recognition cost, as the input to a downstream content-safety classifier, enabling moderation of the model's spoken output without a separate transcription stage; we note, however, that because this trace is derived </w:t>
+      </w:r>
+      <w:r>
+        <w:rPr>
+          <w:i/>
+          <w:sz w:val="21"/>
+        </w:rPr>
+        <w:t>from</w:t>
+      </w:r>
+      <w:r>
+        <w:rPr>
+          <w:sz w:val="21"/>
+        </w:rPr>
+        <w:t xml:space="preserve"> the output audio rather than ahead of it, such moderation is reactive rather than preventive, and turning it into a buffer-gated preventive guardrail (using the same playout buffer of Eq. (3)) without inflating live latency remains an open problem. Beyond the 2D/VRM screen rendering used here, emerging volumetric and light-field display technologies [34] represent a longer-term presentation medium for the same embodied-agent pipeline.</w:t>
       </w:r>
     </w:p>
     <w:p>

</xml_diff>

<commit_message>
paper: added-latency benchmark (§V-E Table 9) + dual lip-sync toggle + live instrumentation
- avatar.html SYS1/SYS2 ON/OFF toggle UI; main.py/ui.py wiring; SYS2 (HuBERT)
  wired from dead code to live post-turn dispatch with audio-suppression.
- Live per-turn latency instrumentation (perf_counter stamps → eval_work/
  live_latency.jsonl); reproduction scripts latency_{eval,driver,live,mfa}.py.
- §V-E Table 9: 3-way added-latency comparison on N=50 — deployed streaming
  engine (mouth ready ~349 ms before audio) vs HuBERT (~21 s, buffer-dominant)
  vs MFA oracle (~17.6 s, non-causal). Fills latency × alignment plane;
  TranscriptionSync at the causal frontier. Rhubarb/Wav2Lip/Audio2Face flagged
  as future work (toolchain/GPU). Latency kept strictly distinct from alignment.

Co-Authored-By: Claude Opus 4.8 <noreply@anthropic.com>
</commit_message>
<xml_diff>
--- a/paper/ATLAS_IEEE_Access_Draft.docx
+++ b/paper/ATLAS_IEEE_Access_Draft.docx
@@ -4964,7 +4964,20 @@
         <w:rPr>
           <w:sz w:val="21"/>
         </w:rPr>
-        <w:t>We benchmark TranscriptionSync's three layers as standalone, component-wise modules on a commodity 4-core/8-thread x86_64 CPU, decoupled from the live Gemini Live integration (Section VI-B, Limitations, discusses the remaining live end-to-end instrumentation as future work).</w:t>
+        <w:t xml:space="preserve">We benchmark TranscriptionSync's three layers as standalone, component-wise modules on a commodity 4-core/8-thread x86_64 CPU; we then report (Table 9) the live, deployed </w:t>
+      </w:r>
+      <w:r>
+        <w:rPr>
+          <w:i/>
+          <w:sz w:val="21"/>
+        </w:rPr>
+        <w:t>avatar-side added latency</w:t>
+      </w:r>
+      <w:r>
+        <w:rPr>
+          <w:sz w:val="21"/>
+        </w:rPr>
+        <w:t xml:space="preserve"> measured inside the running Gemini Live integration. Full voice-to-voice T₀–T₃ instrumentation, which additionally captures the LLM's own generation latency, remains future work (Section VI-B, Limitations).</w:t>
       </w:r>
     </w:p>
     <w:p>
@@ -5784,9 +5797,667 @@
       </w:pPr>
       <w:r>
         <w:rPr>
-          <w:sz w:val="21"/>
-        </w:rPr>
-        <w:t>We have not yet instrumented the full live voice-to-voice pipeline (T₀–T₃ of the original protocol, requiring Gemini Live API integration); this remains an open measurement, noted in Section VI-B.</w:t>
+          <w:b/>
+          <w:sz w:val="21"/>
+        </w:rPr>
+        <w:t>Live deployed added latency: streaming vs. buffered lip-sync.</w:t>
+      </w:r>
+      <w:r>
+        <w:rPr>
+          <w:sz w:val="21"/>
+        </w:rPr>
+        <w:t xml:space="preserve"> The component-wise figures above isolate TranscriptionSync's own layers; we additionally instrument, inside the running A.T.L.A.S–Gemini Live deployment, the </w:t>
+      </w:r>
+      <w:r>
+        <w:rPr>
+          <w:i/>
+          <w:sz w:val="21"/>
+        </w:rPr>
+        <w:t>avatar-side added latency</w:t>
+      </w:r>
+      <w:r>
+        <w:rPr>
+          <w:sz w:val="21"/>
+        </w:rPr>
+        <w:t xml:space="preserve"> — the delay from output-audio availability to the first mouth motion — for two lip-sync architectures sharing the same CPU: the deployed streaming viseme engine (the real-time, transcription-driven path that ships in the assistant) and a learned audio-driven alternative (a 326 M-parameter HuBERT-Transformer regressor, representative of the family-(ii) approach the Introduction argues is GPU-bound [11], [36], [37]). Per-turn </w:t>
+      </w:r>
+      <w:r>
+        <w:rPr>
+          <w:rFonts w:ascii="Consolas" w:hAnsi="Consolas"/>
+          <w:sz w:val="19"/>
+        </w:rPr>
+        <w:t>perf_counter</w:t>
+      </w:r>
+      <w:r>
+        <w:rPr>
+          <w:sz w:val="21"/>
+        </w:rPr>
+        <w:t xml:space="preserve"> stamps recorded </w:t>
+      </w:r>
+      <w:r>
+        <w:rPr>
+          <w:rFonts w:ascii="Consolas" w:hAnsi="Consolas"/>
+          <w:sz w:val="19"/>
+        </w:rPr>
+        <w:t>t_audio_first</w:t>
+      </w:r>
+      <w:r>
+        <w:rPr>
+          <w:sz w:val="21"/>
+        </w:rPr>
+        <w:t xml:space="preserve">, </w:t>
+      </w:r>
+      <w:r>
+        <w:rPr>
+          <w:rFonts w:ascii="Consolas" w:hAnsi="Consolas"/>
+          <w:sz w:val="19"/>
+        </w:rPr>
+        <w:t>t_turn_complete</w:t>
+      </w:r>
+      <w:r>
+        <w:rPr>
+          <w:sz w:val="21"/>
+        </w:rPr>
+        <w:t xml:space="preserve">, the dispatch/ready instants, and the first rendered mouth frame; </w:t>
+      </w:r>
+      <w:r>
+        <w:rPr>
+          <w:rFonts w:ascii="Consolas" w:hAnsi="Consolas"/>
+          <w:sz w:val="19"/>
+        </w:rPr>
+        <w:t>paper/tools/latency_{eval,driver,live}.py</w:t>
+      </w:r>
+      <w:r>
+        <w:rPr>
+          <w:sz w:val="21"/>
+        </w:rPr>
+        <w:t xml:space="preserve"> reproduce the offline and live measurements. This added latency is strictly distinct from the </w:t>
+      </w:r>
+      <w:r>
+        <w:rPr>
+          <w:i/>
+          <w:sz w:val="21"/>
+        </w:rPr>
+        <w:t>alignment</w:t>
+      </w:r>
+      <w:r>
+        <w:rPr>
+          <w:sz w:val="21"/>
+        </w:rPr>
+        <w:t xml:space="preserve"> error of Section V-C: it measures </w:t>
+      </w:r>
+      <w:r>
+        <w:rPr>
+          <w:i/>
+          <w:sz w:val="21"/>
+        </w:rPr>
+        <w:t>when</w:t>
+      </w:r>
+      <w:r>
+        <w:rPr>
+          <w:sz w:val="21"/>
+        </w:rPr>
+        <w:t xml:space="preserve"> the mouth begins moving relative to the audio, not how well the two line up once moving.</w:t>
+      </w:r>
+    </w:p>
+    <w:p>
+      <w:pPr>
+        <w:jc w:val="both"/>
+      </w:pPr>
+      <w:r>
+        <w:rPr>
+          <w:b/>
+          <w:sz w:val="21"/>
+        </w:rPr>
+        <w:t>TABLE 9.</w:t>
+      </w:r>
+      <w:r>
+        <w:rPr>
+          <w:sz w:val="21"/>
+        </w:rPr>
+        <w:t xml:space="preserve"> Avatar-side added lip-sync latency, by architecture, on the same commodity CPU and the same 50-utterance evaluation set (Section V-B): the deployed streaming engine vs. two non-causal baselines — a learned audio-driven model (HuBERT, 326 M parameters) and the MFA forced-alignment oracle that already serves as the LVD reference (Section V-C). Means with percentile-bootstrap 95% CIs (10 000 resamples) where a per-utterance distribution exists; the streaming and HuBERT rows are additionally confirmed live over the UI WebSocket with the microphone muted (streaming N = 8, HuBERT N = 4 short turns). Added latency is the delay from output-audio availability to first mouth motion — distinct from alignment error (Section V-C).</w:t>
+      </w:r>
+    </w:p>
+    <w:tbl>
+      <w:tblPr>
+        <w:tblStyle w:val="TableGrid"/>
+        <w:tblW w:type="auto" w:w="0"/>
+        <w:jc w:val="center"/>
+        <w:tblLook w:firstColumn="1" w:firstRow="1" w:lastColumn="0" w:lastRow="0" w:noHBand="0" w:noVBand="1" w:val="04A0"/>
+      </w:tblPr>
+      <w:tblGrid>
+        <w:gridCol w:w="2436"/>
+        <w:gridCol w:w="2436"/>
+        <w:gridCol w:w="2436"/>
+        <w:gridCol w:w="2436"/>
+      </w:tblGrid>
+      <w:tr>
+        <w:tc>
+          <w:tcPr>
+            <w:tcW w:type="dxa" w:w="2436"/>
+            <w:shd w:val="clear" w:fill="BDD7EE"/>
+          </w:tcPr>
+          <w:p>
+            <w:r>
+              <w:rPr>
+                <w:b/>
+                <w:sz w:val="19"/>
+              </w:rPr>
+              <w:t>Quantity</w:t>
+            </w:r>
+          </w:p>
+        </w:tc>
+        <w:tc>
+          <w:tcPr>
+            <w:tcW w:type="dxa" w:w="2436"/>
+            <w:shd w:val="clear" w:fill="BDD7EE"/>
+          </w:tcPr>
+          <w:p>
+            <w:r>
+              <w:rPr>
+                <w:b/>
+                <w:sz w:val="19"/>
+              </w:rPr>
+              <w:t>Deployed streaming engine</w:t>
+            </w:r>
+          </w:p>
+        </w:tc>
+        <w:tc>
+          <w:tcPr>
+            <w:tcW w:type="dxa" w:w="2436"/>
+            <w:shd w:val="clear" w:fill="BDD7EE"/>
+          </w:tcPr>
+          <w:p>
+            <w:r>
+              <w:rPr>
+                <w:b/>
+                <w:sz w:val="19"/>
+              </w:rPr>
+              <w:t>Learned audio-driven (HuBERT)</w:t>
+            </w:r>
+          </w:p>
+        </w:tc>
+        <w:tc>
+          <w:tcPr>
+            <w:tcW w:type="dxa" w:w="2436"/>
+            <w:shd w:val="clear" w:fill="BDD7EE"/>
+          </w:tcPr>
+          <w:p>
+            <w:r>
+              <w:rPr>
+                <w:b/>
+                <w:sz w:val="19"/>
+              </w:rPr>
+              <w:t>Forced-alignment oracle (MFA)</w:t>
+            </w:r>
+          </w:p>
+        </w:tc>
+      </w:tr>
+      <w:tr>
+        <w:tc>
+          <w:tcPr>
+            <w:tcW w:type="dxa" w:w="2436"/>
+          </w:tcPr>
+          <w:p>
+            <w:r>
+              <w:rPr>
+                <w:sz w:val="19"/>
+              </w:rPr>
+              <w:t>Architecture</w:t>
+            </w:r>
+          </w:p>
+        </w:tc>
+        <w:tc>
+          <w:tcPr>
+            <w:tcW w:type="dxa" w:w="2436"/>
+          </w:tcPr>
+          <w:p>
+            <w:r>
+              <w:rPr>
+                <w:sz w:val="19"/>
+              </w:rPr>
+              <w:t>streaming (per output chunk)</w:t>
+            </w:r>
+          </w:p>
+        </w:tc>
+        <w:tc>
+          <w:tcPr>
+            <w:tcW w:type="dxa" w:w="2436"/>
+          </w:tcPr>
+          <w:p>
+            <w:r>
+              <w:rPr>
+                <w:sz w:val="19"/>
+              </w:rPr>
+              <w:t>buffered (whole utterance)</w:t>
+            </w:r>
+          </w:p>
+        </w:tc>
+        <w:tc>
+          <w:tcPr>
+            <w:tcW w:type="dxa" w:w="2436"/>
+          </w:tcPr>
+          <w:p>
+            <w:r>
+              <w:rPr>
+                <w:sz w:val="19"/>
+              </w:rPr>
+              <w:t>buffered (whole utterance + transcript)</w:t>
+            </w:r>
+          </w:p>
+        </w:tc>
+      </w:tr>
+      <w:tr>
+        <w:tc>
+          <w:tcPr>
+            <w:tcW w:type="dxa" w:w="2436"/>
+          </w:tcPr>
+          <w:p>
+            <w:r>
+              <w:rPr>
+                <w:sz w:val="19"/>
+              </w:rPr>
+              <w:t>Causal?</w:t>
+            </w:r>
+          </w:p>
+        </w:tc>
+        <w:tc>
+          <w:tcPr>
+            <w:tcW w:type="dxa" w:w="2436"/>
+          </w:tcPr>
+          <w:p>
+            <w:r>
+              <w:rPr>
+                <w:sz w:val="19"/>
+              </w:rPr>
+              <w:t>yes</w:t>
+            </w:r>
+          </w:p>
+        </w:tc>
+        <w:tc>
+          <w:tcPr>
+            <w:tcW w:type="dxa" w:w="2436"/>
+          </w:tcPr>
+          <w:p>
+            <w:r>
+              <w:rPr>
+                <w:sz w:val="19"/>
+              </w:rPr>
+              <w:t>no</w:t>
+            </w:r>
+          </w:p>
+        </w:tc>
+        <w:tc>
+          <w:tcPr>
+            <w:tcW w:type="dxa" w:w="2436"/>
+          </w:tcPr>
+          <w:p>
+            <w:r>
+              <w:rPr>
+                <w:sz w:val="19"/>
+              </w:rPr>
+              <w:t>no</w:t>
+            </w:r>
+          </w:p>
+        </w:tc>
+      </w:tr>
+      <w:tr>
+        <w:tc>
+          <w:tcPr>
+            <w:tcW w:type="dxa" w:w="2436"/>
+          </w:tcPr>
+          <w:p>
+            <w:r>
+              <w:rPr>
+                <w:sz w:val="19"/>
+              </w:rPr>
+              <w:t>Buffer latency</w:t>
+            </w:r>
+          </w:p>
+        </w:tc>
+        <w:tc>
+          <w:tcPr>
+            <w:tcW w:type="dxa" w:w="2436"/>
+          </w:tcPr>
+          <w:p>
+            <w:r>
+              <w:rPr>
+                <w:sz w:val="19"/>
+              </w:rPr>
+              <w:t>0 (structural — streams per chunk)</w:t>
+            </w:r>
+          </w:p>
+        </w:tc>
+        <w:tc>
+          <w:tcPr>
+            <w:tcW w:type="dxa" w:w="2436"/>
+          </w:tcPr>
+          <w:p>
+            <w:r>
+              <w:rPr>
+                <w:sz w:val="19"/>
+              </w:rPr>
+              <w:t>= utterance duration: live 3.15 s [2.44, 3.86] ≈ audio 3.16 s; offline 15.56 s (N = 50)</w:t>
+            </w:r>
+          </w:p>
+        </w:tc>
+        <w:tc>
+          <w:tcPr>
+            <w:tcW w:type="dxa" w:w="2436"/>
+          </w:tcPr>
+          <w:p>
+            <w:r>
+              <w:rPr>
+                <w:sz w:val="19"/>
+              </w:rPr>
+              <w:t>= utterance duration: 15.56 s (N = 50)</w:t>
+            </w:r>
+          </w:p>
+        </w:tc>
+      </w:tr>
+      <w:tr>
+        <w:tc>
+          <w:tcPr>
+            <w:tcW w:type="dxa" w:w="2436"/>
+          </w:tcPr>
+          <w:p>
+            <w:r>
+              <w:rPr>
+                <w:sz w:val="19"/>
+              </w:rPr>
+              <w:t>Compute</w:t>
+            </w:r>
+          </w:p>
+        </w:tc>
+        <w:tc>
+          <w:tcPr>
+            <w:tcW w:type="dxa" w:w="2436"/>
+          </w:tcPr>
+          <w:p>
+            <w:r>
+              <w:rPr>
+                <w:sz w:val="19"/>
+              </w:rPr>
+              <w:t>table lookup, 0.8 µs/frame</w:t>
+            </w:r>
+          </w:p>
+        </w:tc>
+        <w:tc>
+          <w:tcPr>
+            <w:tcW w:type="dxa" w:w="2436"/>
+          </w:tcPr>
+          <w:p>
+            <w:r>
+              <w:rPr>
+                <w:sz w:val="19"/>
+              </w:rPr>
+              <w:t>326 M-param forward pass: CPU 1.77 s live [1.05, 2.49] / 5.68 s offline [5.25, 6.13]</w:t>
+            </w:r>
+          </w:p>
+        </w:tc>
+        <w:tc>
+          <w:tcPr>
+            <w:tcW w:type="dxa" w:w="2436"/>
+          </w:tcPr>
+          <w:p>
+            <w:r>
+              <w:rPr>
+                <w:sz w:val="19"/>
+              </w:rPr>
+              <w:t>forced alignment: 2.05 s/utt (batch-amortized, CPU)</w:t>
+            </w:r>
+          </w:p>
+        </w:tc>
+      </w:tr>
+      <w:tr>
+        <w:tc>
+          <w:tcPr>
+            <w:tcW w:type="dxa" w:w="2436"/>
+          </w:tcPr>
+          <w:p>
+            <w:r>
+              <w:rPr>
+                <w:sz w:val="19"/>
+              </w:rPr>
+              <w:t>Transport</w:t>
+            </w:r>
+          </w:p>
+        </w:tc>
+        <w:tc>
+          <w:tcPr>
+            <w:tcW w:type="dxa" w:w="2436"/>
+          </w:tcPr>
+          <w:p>
+            <w:r>
+              <w:rPr>
+                <w:sz w:val="19"/>
+              </w:rPr>
+              <w:t>text→render 20.7 ms [20.4, 20.9]</w:t>
+            </w:r>
+          </w:p>
+        </w:tc>
+        <w:tc>
+          <w:tcPr>
+            <w:tcW w:type="dxa" w:w="2436"/>
+          </w:tcPr>
+          <w:p>
+            <w:r>
+              <w:rPr>
+                <w:sz w:val="19"/>
+              </w:rPr>
+              <w:t>HTTP round-trip 63 ms [59, 68]</w:t>
+            </w:r>
+          </w:p>
+        </w:tc>
+        <w:tc>
+          <w:tcPr>
+            <w:tcW w:type="dxa" w:w="2436"/>
+          </w:tcPr>
+          <w:p>
+            <w:r>
+              <w:rPr>
+                <w:sz w:val="19"/>
+              </w:rPr>
+              <w:t>n/a (offline file)</w:t>
+            </w:r>
+          </w:p>
+        </w:tc>
+      </w:tr>
+      <w:tr>
+        <w:tc>
+          <w:tcPr>
+            <w:tcW w:type="dxa" w:w="2436"/>
+          </w:tcPr>
+          <w:p>
+            <w:r>
+              <w:rPr>
+                <w:sz w:val="19"/>
+              </w:rPr>
+              <w:t>Mouth-vs-audio onset</w:t>
+            </w:r>
+          </w:p>
+        </w:tc>
+        <w:tc>
+          <w:tcPr>
+            <w:tcW w:type="dxa" w:w="2436"/>
+          </w:tcPr>
+          <w:p>
+            <w:r>
+              <w:rPr>
+                <w:sz w:val="19"/>
+              </w:rPr>
+              <w:t xml:space="preserve">mouth ready 349 ms [321, 380] </w:t>
+            </w:r>
+            <w:r>
+              <w:rPr>
+                <w:i/>
+                <w:sz w:val="19"/>
+              </w:rPr>
+              <w:t>before</w:t>
+            </w:r>
+            <w:r>
+              <w:rPr>
+                <w:sz w:val="19"/>
+              </w:rPr>
+              <w:t xml:space="preserve"> audio</w:t>
+            </w:r>
+          </w:p>
+        </w:tc>
+        <w:tc>
+          <w:tcPr>
+            <w:tcW w:type="dxa" w:w="2436"/>
+          </w:tcPr>
+          <w:p>
+            <w:r>
+              <w:rPr>
+                <w:sz w:val="19"/>
+              </w:rPr>
+              <w:t xml:space="preserve">21.30 s [19.70, 22.91] </w:t>
+            </w:r>
+            <w:r>
+              <w:rPr>
+                <w:i/>
+                <w:sz w:val="19"/>
+              </w:rPr>
+              <w:t>after</w:t>
+            </w:r>
+            <w:r>
+              <w:rPr>
+                <w:sz w:val="19"/>
+              </w:rPr>
+              <w:t xml:space="preserve"> audio (offline, N = 50)</w:t>
+            </w:r>
+          </w:p>
+        </w:tc>
+        <w:tc>
+          <w:tcPr>
+            <w:tcW w:type="dxa" w:w="2436"/>
+          </w:tcPr>
+          <w:p>
+            <w:r>
+              <w:rPr>
+                <w:sz w:val="19"/>
+              </w:rPr>
+              <w:t xml:space="preserve">≈ 17.6 s </w:t>
+            </w:r>
+            <w:r>
+              <w:rPr>
+                <w:i/>
+                <w:sz w:val="19"/>
+              </w:rPr>
+              <w:t>after</w:t>
+            </w:r>
+            <w:r>
+              <w:rPr>
+                <w:sz w:val="19"/>
+              </w:rPr>
+              <w:t xml:space="preserve"> audio (N = 50)</w:t>
+            </w:r>
+          </w:p>
+        </w:tc>
+      </w:tr>
+    </w:tbl>
+    <w:p/>
+    <w:p>
+      <w:pPr>
+        <w:jc w:val="both"/>
+      </w:pPr>
+      <w:r>
+        <w:rPr>
+          <w:sz w:val="21"/>
+        </w:rPr>
+        <w:t xml:space="preserve">Three findings stand out. </w:t>
+      </w:r>
+      <w:r>
+        <w:rPr>
+          <w:b/>
+          <w:sz w:val="21"/>
+        </w:rPr>
+        <w:t>First, the streaming engine adds no perceptible latency — the mouth is ready before the audio.</w:t>
+      </w:r>
+      <w:r>
+        <w:rPr>
+          <w:sz w:val="21"/>
+        </w:rPr>
+        <w:t xml:space="preserve"> Because the deployed engine drives visemes from the output transcription stream, the mouth-driving text arrives a mean 349 ms </w:t>
+      </w:r>
+      <w:r>
+        <w:rPr>
+          <w:i/>
+          <w:sz w:val="21"/>
+        </w:rPr>
+        <w:t>ahead</w:t>
+      </w:r>
+      <w:r>
+        <w:rPr>
+          <w:sz w:val="21"/>
+        </w:rPr>
+        <w:t xml:space="preserve"> of the corresponding audio, and rendering it costs only 20.7 ms (text→first-frame); the mouth pose is therefore available before its audio plays, so the engine has negative added latency by construction rather than racing the audio. </w:t>
+      </w:r>
+      <w:r>
+        <w:rPr>
+          <w:b/>
+          <w:sz w:val="21"/>
+        </w:rPr>
+        <w:t>Second, the buffered learned model pays a latency that the offline estimate predicted and the live run confirms.</w:t>
+      </w:r>
+      <w:r>
+        <w:rPr>
+          <w:sz w:val="21"/>
+        </w:rPr>
+        <w:t xml:space="preserve"> A non-streaming audio-driven model cannot emit a frame until the utterance is complete, so its buffer latency equals the utterance duration — confirmed live (3.15 s measured vs. 3.16 s audio), and reaching 15.56 s on the longer evaluation utterances — on top of a 326 M-parameter forward pass (5.68 s on this CPU). </w:t>
+      </w:r>
+      <w:r>
+        <w:rPr>
+          <w:b/>
+          <w:sz w:val="21"/>
+        </w:rPr>
+        <w:t>Third, and decisively, the quality oracle is itself non-causal and offline.</w:t>
+      </w:r>
+      <w:r>
+        <w:rPr>
+          <w:sz w:val="21"/>
+        </w:rPr>
+        <w:t xml:space="preserve"> MFA — which by construction produces the lowest-error alignment and serves as the LVD reference of Section V-C — must consume the complete utterance </w:t>
+      </w:r>
+      <w:r>
+        <w:rPr>
+          <w:i/>
+          <w:sz w:val="21"/>
+        </w:rPr>
+        <w:t>and</w:t>
+      </w:r>
+      <w:r>
+        <w:rPr>
+          <w:sz w:val="21"/>
+        </w:rPr>
+        <w:t xml:space="preserve"> its transcript before emitting a single boundary, so it incurs the same utterance-length buffer (15.56 s) plus 2.05 s of alignment compute, ≈ 17.6 s of added latency. Notably its compute is </w:t>
+      </w:r>
+      <w:r>
+        <w:rPr>
+          <w:i/>
+          <w:sz w:val="21"/>
+        </w:rPr>
+        <w:t>faster</w:t>
+      </w:r>
+      <w:r>
+        <w:rPr>
+          <w:sz w:val="21"/>
+        </w:rPr>
+        <w:t xml:space="preserve"> than HuBERT's, yet it remains unusable in real time: the disqualifier is non-causality (the buffer), not raw speed. Together these place the three engines on a latency × alignment plane: MFA at highest fidelity but ≈ 17.6 s offline, HuBERT learned but ≈ 21 s on CPU, and the streaming engine at the causal, zero-added-latency frontier with the lowest LVD among causal conditions (0.461, Section V-C). The inference/compute terms are device-dependent (a GPU would cut HuBERT's by one to two orders of magnitude [36]), but the buffer term is </w:t>
+      </w:r>
+      <w:r>
+        <w:rPr>
+          <w:i/>
+          <w:sz w:val="21"/>
+        </w:rPr>
+        <w:t>architectural and irreducible</w:t>
+      </w:r>
+      <w:r>
+        <w:rPr>
+          <w:sz w:val="21"/>
+        </w:rPr>
+        <w:t xml:space="preserve"> for any non-causal method: even with instantaneous compute, both baselines would still trail the audio by the full utterance duration. This is the latency wall that motivates a streaming, phoneme-timing-free design for a CPU-budget desktop assistant, and complements the language-asymmetry finding above. Open-source CPU viseme baselines (e.g., Rhubarb Lip Sync) and GPU-class learned models (Audio2Face, Wav2Lip) would further populate the plane but require additional toolchains or accelerators beyond the present single-CPU, single-vendor setup; we leave them to future work. The full LLM-inclusive voice-to-voice pipeline (T₀–T₃, including Gemini's own generation latency) likewise remains a separate open measurement (Section VI-B).</w:t>
       </w:r>
     </w:p>
     <w:p>
@@ -7971,7 +8642,7 @@
         <w:rPr>
           <w:sz w:val="21"/>
         </w:rPr>
-        <w:t xml:space="preserve"> live timestamps, but timing is no longer a dominant error source. We note that this conclusion is sensitive to evaluation methodology: word-timing error must be scored over content-matched tokens, since pairing recognized and reference words by position inflates the apparent error by over an order of magnitude under conversational ASR insertions/deletions. We have also not yet instrumented the full live voice-to-voice pipeline (T₀–T₃), so end-to-end latency under the actual Gemini Live integration remains unmeasured — Section V-E reports component-wise Layer 1-3 costs only. Second, the playout buffer Δ adds a fixed response-latency cost; for English, Δ ≈ 215 ms is small relative to natural turn-taking gaps, but latency-sensitive applications may prefer the zero-delay RATE fallback, and an adaptive Δ tracking the recognizer's recent lag distribution would tighten the cost. Third, ASR errors propagate to articulation; the phonetic-similarity argument suggests this is rarely noticed, but proper-noun-dense or noisy-channel speech may degrade further — an error-aware confidence gate (falling back to RATE below a confidence threshold) is a straightforward hardening. Fourth, the duration priors λ are language-dependent; the present fixed design constants were validated only on English (Section V-D), where their margin over uniform splitting was modest on GRID's short words — per-language fitting against aligned conversational corpora is a clear avenue for tightening Layer-2 timing, and coverage beyond English and Turkish requires it. Fifth, the SyncNet validity analysis above is specific to this avatar and metric; establishing or fine-tuning a synchronization metric that </w:t>
+        <w:t xml:space="preserve"> live timestamps, but timing is no longer a dominant error source. We note that this conclusion is sensitive to evaluation methodology: word-timing error must be scored over content-matched tokens, since pairing recognized and reference words by position inflates the apparent error by over an order of magnitude under conversational ASR insertions/deletions. We instrument the avatar-side added latency live (Section V-E, Table 9), confirming that the deployed streaming engine adds none (the mouth is ready ahead of the audio) while a buffered learned alternative incurs an utterance-length latency; but we have not yet instrumented the full voice-to-voice pipeline (T₀–T₃) including the LLM's own generation latency, which remains unmeasured under the actual Gemini Live integration. Second, the playout buffer Δ adds a fixed response-latency cost; for English, Δ ≈ 215 ms is small relative to natural turn-taking gaps, but latency-sensitive applications may prefer the zero-delay RATE fallback, and an adaptive Δ tracking the recognizer's recent lag distribution would tighten the cost. Third, ASR errors propagate to articulation; the phonetic-similarity argument suggests this is rarely noticed, but proper-noun-dense or noisy-channel speech may degrade further — an error-aware confidence gate (falling back to RATE below a confidence threshold) is a straightforward hardening. Fourth, the duration priors λ are language-dependent; the present fixed design constants were validated only on English (Section V-D), where their margin over uniform splitting was modest on GRID's short words — per-language fitting against aligned conversational corpora is a clear avenue for tightening Layer-2 timing, and coverage beyond English and Turkish requires it. Fifth, the SyncNet validity analysis above is specific to this avatar and metric; establishing or fine-tuning a synchronization metric that </w:t>
       </w:r>
       <w:r>
         <w:rPr>

</xml_diff>

<commit_message>
paper: fit docx tables to page width (4-column Table 9 no longer overflows)
build_paper_docx.py: set every table to span 100% of the text column with
autofit layout, so wide tables wrap inside the page. Rebuilt both docx copies.

Co-Authored-By: Claude Opus 4.8 <noreply@anthropic.com>
</commit_message>
<xml_diff>
--- a/paper/ATLAS_IEEE_Access_Draft.docx
+++ b/paper/ATLAS_IEEE_Access_Draft.docx
@@ -856,9 +856,10 @@
     <w:tbl>
       <w:tblPr>
         <w:tblStyle w:val="TableGrid"/>
-        <w:tblW w:type="auto" w:w="0"/>
         <w:jc w:val="center"/>
         <w:tblLook w:firstColumn="1" w:firstRow="1" w:lastColumn="0" w:lastRow="0" w:noHBand="0" w:noVBand="1" w:val="04A0"/>
+        <w:tblW w:type="pct" w:w="5000"/>
+        <w:tblLayout w:type="autofit"/>
       </w:tblPr>
       <w:tblGrid>
         <w:gridCol w:w="3249"/>
@@ -1358,9 +1359,10 @@
     <w:tbl>
       <w:tblPr>
         <w:tblStyle w:val="TableGrid"/>
-        <w:tblW w:type="auto" w:w="0"/>
         <w:jc w:val="center"/>
         <w:tblLook w:firstColumn="1" w:firstRow="1" w:lastColumn="0" w:lastRow="0" w:noHBand="0" w:noVBand="1" w:val="04A0"/>
+        <w:tblW w:type="pct" w:w="5000"/>
+        <w:tblLayout w:type="autofit"/>
       </w:tblPr>
       <w:tblGrid>
         <w:gridCol w:w="3249"/>
@@ -2489,9 +2491,10 @@
     <w:tbl>
       <w:tblPr>
         <w:tblStyle w:val="TableGrid"/>
-        <w:tblW w:type="auto" w:w="0"/>
         <w:jc w:val="center"/>
         <w:tblLook w:firstColumn="1" w:firstRow="1" w:lastColumn="0" w:lastRow="0" w:noHBand="0" w:noVBand="1" w:val="04A0"/>
+        <w:tblW w:type="pct" w:w="5000"/>
+        <w:tblLayout w:type="autofit"/>
       </w:tblPr>
       <w:tblGrid>
         <w:gridCol w:w="3249"/>
@@ -3484,9 +3487,10 @@
     <w:tbl>
       <w:tblPr>
         <w:tblStyle w:val="TableGrid"/>
-        <w:tblW w:type="auto" w:w="0"/>
         <w:jc w:val="center"/>
         <w:tblLook w:firstColumn="1" w:firstRow="1" w:lastColumn="0" w:lastRow="0" w:noHBand="0" w:noVBand="1" w:val="04A0"/>
+        <w:tblW w:type="pct" w:w="5000"/>
+        <w:tblLayout w:type="autofit"/>
       </w:tblPr>
       <w:tblGrid>
         <w:gridCol w:w="1624"/>
@@ -4491,9 +4495,10 @@
     <w:tbl>
       <w:tblPr>
         <w:tblStyle w:val="TableGrid"/>
-        <w:tblW w:type="auto" w:w="0"/>
         <w:jc w:val="center"/>
         <w:tblLook w:firstColumn="1" w:firstRow="1" w:lastColumn="0" w:lastRow="0" w:noHBand="0" w:noVBand="1" w:val="04A0"/>
+        <w:tblW w:type="pct" w:w="5000"/>
+        <w:tblLayout w:type="autofit"/>
       </w:tblPr>
       <w:tblGrid>
         <w:gridCol w:w="3249"/>
@@ -5076,9 +5081,10 @@
     <w:tbl>
       <w:tblPr>
         <w:tblStyle w:val="TableGrid"/>
-        <w:tblW w:type="auto" w:w="0"/>
         <w:jc w:val="center"/>
         <w:tblLook w:firstColumn="1" w:firstRow="1" w:lastColumn="0" w:lastRow="0" w:noHBand="0" w:noVBand="1" w:val="04A0"/>
+        <w:tblW w:type="pct" w:w="5000"/>
+        <w:tblLayout w:type="autofit"/>
       </w:tblPr>
       <w:tblGrid>
         <w:gridCol w:w="2436"/>
@@ -5921,9 +5927,10 @@
     <w:tbl>
       <w:tblPr>
         <w:tblStyle w:val="TableGrid"/>
-        <w:tblW w:type="auto" w:w="0"/>
         <w:jc w:val="center"/>
         <w:tblLook w:firstColumn="1" w:firstRow="1" w:lastColumn="0" w:lastRow="0" w:noHBand="0" w:noVBand="1" w:val="04A0"/>
+        <w:tblW w:type="pct" w:w="5000"/>
+        <w:tblLayout w:type="autofit"/>
       </w:tblPr>
       <w:tblGrid>
         <w:gridCol w:w="2436"/>
@@ -6781,9 +6788,10 @@
     <w:tbl>
       <w:tblPr>
         <w:tblStyle w:val="TableGrid"/>
-        <w:tblW w:type="auto" w:w="0"/>
         <w:jc w:val="center"/>
         <w:tblLook w:firstColumn="1" w:firstRow="1" w:lastColumn="0" w:lastRow="0" w:noHBand="0" w:noVBand="1" w:val="04A0"/>
+        <w:tblW w:type="pct" w:w="5000"/>
+        <w:tblLayout w:type="autofit"/>
       </w:tblPr>
       <w:tblGrid>
         <w:gridCol w:w="1218"/>
@@ -8049,9 +8057,10 @@
     <w:tbl>
       <w:tblPr>
         <w:tblStyle w:val="TableGrid"/>
-        <w:tblW w:type="auto" w:w="0"/>
         <w:jc w:val="center"/>
         <w:tblLook w:firstColumn="1" w:firstRow="1" w:lastColumn="0" w:lastRow="0" w:noHBand="0" w:noVBand="1" w:val="04A0"/>
+        <w:tblW w:type="pct" w:w="5000"/>
+        <w:tblLayout w:type="autofit"/>
       </w:tblPr>
       <w:tblGrid>
         <w:gridCol w:w="1949"/>

</xml_diff>

<commit_message>
paper: sharpen §II-D related-work differentiation (lit-search validated)
Web literature check found no peer-reviewed work doing causal, CPU, ASR-of-
output-driven lip-sync for native-audio LLMs; closest are frequency-driven
SDKs (= AMP class), TTS-viseme pipelines (need a synthesizer), or learned
GPU audio-driven models. Two surgical edits, no new citations:
- family (i): native-audio model *is* the synthesizer — no TTS stage to emit a
  phoneme/viseme-timing stream as streaming-TTS avatar pipelines do (closes the
  "why not use TTS visemes" reviewer question).
- family (iii): explicitly ties deployed real-time avatar SDKs (spectral-energy
  → mouth opening) to the AMP lower anchor.

Co-Authored-By: Claude Opus 4.8 <noreply@anthropic.com>
</commit_message>
<xml_diff>
--- a/paper/ATLAS_IEEE_Access_Draft.docx
+++ b/paper/ATLAS_IEEE_Access_Draft.docx
@@ -601,7 +601,20 @@
         <w:rPr>
           <w:sz w:val="21"/>
         </w:rPr>
-        <w:t xml:space="preserve"> heuristics that open the jaw proportionally to signal energy, common in commercial avatar SDKs [22]. Family (i) is inapplicable to native-audio LLMs: there is no synthesizer to query for phoneme schedules, and forced aligners are non-causal. Family (ii) does apply to raw PCM, and recent systems achieve impressive real-time throughput — Livatar-1 reports 0.17 s end-to-end latency on a dedicated NVIDIA A10 [36], and TalkingMachines serves autoregressive diffusion avatars from H100 clusters [37] — but these budgets are incompatible with a consumer desktop assistant; family (ii) also requires training data and produces video rather than retargetable blendshape parameters. Family (iii) is causal and free but produces visibly implausible, single-degree-of-freedom motion. The practical urgency of this gap is evidenced by commercial SDKs that have recently begun shipping undocumented viseme-injection layers for exactly these APIs [38], [39] — without, to our knowledge, any published method description or quantitative evaluation. TranscriptionSync occupies a previously unexplored point in this design space: it restores the articulatory specificity of family (i) in a </w:t>
+        <w:t xml:space="preserve"> heuristics that open the jaw proportionally to signal energy, common in commercial avatar SDKs [22]. Family (i) is inapplicable to native-audio LLMs: the model </w:t>
+      </w:r>
+      <w:r>
+        <w:rPr>
+          <w:i/>
+          <w:sz w:val="21"/>
+        </w:rPr>
+        <w:t>is</w:t>
+      </w:r>
+      <w:r>
+        <w:rPr>
+          <w:sz w:val="21"/>
+        </w:rPr>
+        <w:t xml:space="preserve"> the synthesizer — speech is generated inside the LLM with no separate TTS stage that could emit a phoneme schedule or a word/viseme-timing stream alongside the audio, as streaming-TTS avatar pipelines do — and forced aligners that might recover such timing post hoc are non-causal. Family (ii) does apply to raw PCM, and recent systems achieve impressive real-time throughput — Livatar-1 reports 0.17 s end-to-end latency on a dedicated NVIDIA A10 [36], and TalkingMachines serves autoregressive diffusion avatars from H100 clusters [37] — but these budgets are incompatible with a consumer desktop assistant; family (ii) also requires training data and produces video rather than retargetable blendshape parameters. Family (iii) is causal and free but produces visibly implausible, single-degree-of-freedom motion; it is nonetheless what most deployed real-time avatar SDKs use — mapping the audio's spectral energy directly to mouth opening — and is the class our evaluation represents with the AMP lower anchor. The practical urgency of this gap is evidenced by commercial SDKs that have recently begun shipping undocumented viseme-injection layers for exactly these APIs [38], [39] — without, to our knowledge, any published method description or quantitative evaluation. TranscriptionSync occupies a previously unexplored point in this design space: it restores the articulatory specificity of family (i) in a </w:t>
       </w:r>
       <w:r>
         <w:rPr>

</xml_diff>